<commit_message>
feat: add full-page scene demo and title cover
</commit_message>
<xml_diff>
--- a/请替我沉默-场景Demo与效果.docx
+++ b/请替我沉默-场景Demo与效果.docx
@@ -1,6 +1,6 @@
 
 <file path=word/document.xml><?xml version="1.0" encoding="utf-8"?>
-<w:document xmlns:w="http://schemas.openxmlformats.org/wordprocessingml/2006/main">
+<w:document xmlns:wp="http://schemas.openxmlformats.org/drawingml/2006/wordprocessingDrawing" xmlns:a="http://schemas.openxmlformats.org/drawingml/2006/main" xmlns:pic="http://schemas.openxmlformats.org/drawingml/2006/picture" xmlns:r="http://schemas.openxmlformats.org/officeDocument/2006/relationships" xmlns:w="http://schemas.openxmlformats.org/wordprocessingml/2006/main">
   <w:body>
     <w:p>
       <w:pPr>
@@ -129,7 +129,7 @@
           <w:szCs w:val="18"/>
           <w:color w:val="808080"/>
         </w:rPr>
-        <w:t xml:space="preserve">五关 Demo + 消音体三阶段 · 设计解读 · 2026-07-30</w:t>
+        <w:t xml:space="preserve">五关 Demo + V4 可玩资产 · 台本对照 · 2026-08-01</w:t>
       </w:r>
     </w:p>
     <w:p>
@@ -332,7 +332,7 @@
           <w:szCs w:val="21"/>
           <w:color w:val="1A1A1A"/>
         </w:rPr>
-        <w:t xml:space="preserve">完整世界观、工期与系统边界见：《请替我沉默-游戏策划案.docx》及仓库内 schedule.md / selling-points.md / art-style.md。</w:t>
+        <w:t xml:space="preserve">完整世界观、工期与系统边界见：仓库内 schedule.md / selling-points.md / art-style.md；当前资产契约见 art/v4/playable/README.md 与 manifest.json。</w:t>
       </w:r>
     </w:p>
     <w:p>
@@ -404,7 +404,7 @@
           <w:rFonts w:ascii="Calibri" w:hAnsi="Calibri" w:eastAsia="Microsoft YaHei"/>
           <w:sz w:val="21"/>
         </w:rPr>
-        <w:t>• 台词层：可读中文对话框（Demo 用关键句示意，真机每关 4—6 句）</w:t>
+        <w:t xml:space="preserve">• 台词层：可读中文对话框（Demo 用关键句示意，真机每关 6—7 句；当前台本共 35 句）</w:t>
       </w:r>
     </w:p>
     <w:p>
@@ -1803,7 +1803,7 @@
           <wp:inline xmlns:wp="http://schemas.openxmlformats.org/drawingml/2006/wordprocessingDrawing" distT="0" distB="0" distL="0" distR="0">
             <wp:extent cx="5760720" cy="3840480"/>
             <wp:effectExtent l="0" t="0" r="0" b="0"/>
-            <wp:docPr id="1" name="D0 核心玩法"/>
+            <wp:docPr id="1" name="V4-D0"/>
             <wp:cNvGraphicFramePr>
               <a:graphicFrameLocks xmlns:a="http://schemas.openxmlformats.org/drawingml/2006/main" noChangeAspect="1"/>
             </wp:cNvGraphicFramePr>
@@ -1811,7 +1811,7 @@
               <a:graphicData uri="http://schemas.openxmlformats.org/drawingml/2006/picture">
                 <pic:pic xmlns:pic="http://schemas.openxmlformats.org/drawingml/2006/picture">
                   <pic:nvPicPr>
-                    <pic:cNvPr id="0" name="D0-core-mechanic.jpg"/>
+                    <pic:cNvPr id="0" name="V4-D0.jpg"/>
                     <pic:cNvPicPr/>
                   </pic:nvPicPr>
                   <pic:blipFill>
@@ -1848,7 +1848,7 @@
           <w:szCs w:val="21"/>
           <w:color w:val="1A1A1A"/>
         </w:rPr>
-        <w:t xml:space="preserve">图 D0  核心机制：拖黑条 · 吃字 · 墨迹生长</w:t>
+        <w:t xml:space="preserve">图 D0  L0_S01：拖黑条 · 吃字 · CREEP_1 桌角生长</w:t>
       </w:r>
     </w:p>
     <w:p>
@@ -2596,7 +2596,7 @@
           <w:szCs w:val="21"/>
           <w:color w:val="1A1A1A"/>
         </w:rPr>
-        <w:t xml:space="preserve">技术实现：不跑 NLP；每句预置 3—4 个合法 zone，拖拽吸附。真机每关 4—6 句，本图只钉一句教学高光。</w:t>
+        <w:t xml:space="preserve">技术实现：不跑 NLP；每句预置 3—4 个合法 zone，拖拽吸附。真机每关 6—7 句（L1 共 7 句），本图只钉一句教学高光。</w:t>
       </w:r>
     </w:p>
     <w:p>
@@ -2693,7 +2693,7 @@
           <wp:inline xmlns:wp="http://schemas.openxmlformats.org/drawingml/2006/wordprocessingDrawing" distT="0" distB="0" distL="0" distR="0">
             <wp:extent cx="5760720" cy="3840480"/>
             <wp:effectExtent l="0" t="0" r="0" b="0"/>
-            <wp:docPr id="2" name="D1 面试"/>
+            <wp:docPr id="2" name="V4-D1"/>
             <wp:cNvGraphicFramePr>
               <a:graphicFrameLocks xmlns:a="http://schemas.openxmlformats.org/drawingml/2006/main" noChangeAspect="1"/>
             </wp:cNvGraphicFramePr>
@@ -2701,7 +2701,7 @@
               <a:graphicData uri="http://schemas.openxmlformats.org/drawingml/2006/picture">
                 <pic:pic xmlns:pic="http://schemas.openxmlformats.org/drawingml/2006/picture">
                   <pic:nvPicPr>
-                    <pic:cNvPr id="0" name="D1-interview.jpg"/>
+                    <pic:cNvPr id="0" name="V4-D1.jpg"/>
                     <pic:cNvPicPr/>
                   </pic:nvPicPr>
                   <pic:blipFill>
@@ -2738,7 +2738,7 @@
           <w:szCs w:val="21"/>
           <w:color w:val="1A1A1A"/>
         </w:rPr>
-        <w:t xml:space="preserve">图 D1  正经会议室面试：中文原句 + 黑条教学</w:t>
+        <w:t xml:space="preserve">图 D1  L1_S03：CHAR_interview_sit + NPC_interviewer_a/b</w:t>
       </w:r>
     </w:p>
     <w:p>
@@ -3305,7 +3305,7 @@
           <wp:inline xmlns:wp="http://schemas.openxmlformats.org/drawingml/2006/wordprocessingDrawing" distT="0" distB="0" distL="0" distR="0">
             <wp:extent cx="5760720" cy="3840480"/>
             <wp:effectExtent l="0" t="0" r="0" b="0"/>
-            <wp:docPr id="3" name="D2 直播"/>
+            <wp:docPr id="3" name="V4-D2"/>
             <wp:cNvGraphicFramePr>
               <a:graphicFrameLocks xmlns:a="http://schemas.openxmlformats.org/drawingml/2006/main" noChangeAspect="1"/>
             </wp:cNvGraphicFramePr>
@@ -3313,7 +3313,7 @@
               <a:graphicData uri="http://schemas.openxmlformats.org/drawingml/2006/picture">
                 <pic:pic xmlns:pic="http://schemas.openxmlformats.org/drawingml/2006/picture">
                   <pic:nvPicPr>
-                    <pic:cNvPr id="0" name="D2-livestream.jpg"/>
+                    <pic:cNvPr id="0" name="V4-D2.jpg"/>
                     <pic:cNvPicPr/>
                   </pic:nvPicPr>
                   <pic:blipFill>
@@ -3350,7 +3350,7 @@
           <w:szCs w:val="21"/>
           <w:color w:val="1A1A1A"/>
         </w:rPr>
-        <w:t xml:space="preserve">图 D2  第一次直播：讨好性正确 + Stage2 附着</w:t>
+        <w:t xml:space="preserve">图 D2  L2_S04：CHAR_livestream_speaking + CRT/live 状态 + CREEP_2</w:t>
       </w:r>
     </w:p>
     <w:p>
@@ -3951,7 +3951,7 @@
           <wp:inline xmlns:wp="http://schemas.openxmlformats.org/drawingml/2006/wordprocessingDrawing" distT="0" distB="0" distL="0" distR="0">
             <wp:extent cx="5760720" cy="3840480"/>
             <wp:effectExtent l="0" t="0" r="0" b="0"/>
-            <wp:docPr id="4" name="D3 朋友"/>
+            <wp:docPr id="4" name="V4-D3"/>
             <wp:cNvGraphicFramePr>
               <a:graphicFrameLocks xmlns:a="http://schemas.openxmlformats.org/drawingml/2006/main" noChangeAspect="1"/>
             </wp:cNvGraphicFramePr>
@@ -3959,7 +3959,7 @@
               <a:graphicData uri="http://schemas.openxmlformats.org/drawingml/2006/picture">
                 <pic:pic xmlns:pic="http://schemas.openxmlformats.org/drawingml/2006/picture">
                   <pic:nvPicPr>
-                    <pic:cNvPr id="0" name="D3-friend-door.jpg"/>
+                    <pic:cNvPr id="0" name="V4-D3.jpg"/>
                     <pic:cNvPicPr/>
                   </pic:nvPicPr>
                   <pic:blipFill>
@@ -3996,7 +3996,7 @@
           <w:szCs w:val="21"/>
           <w:color w:val="1A1A1A"/>
         </w:rPr>
-        <w:t xml:space="preserve">图 D3  朋友上门：门厅两难 + 中央黑条抉择</w:t>
+        <w:t xml:space="preserve">图 D3  L3_S02：CHAR_door + NPC_friend_door_silhouette + knock FX</w:t>
       </w:r>
     </w:p>
     <w:p>
@@ -4531,7 +4531,7 @@
           <wp:inline xmlns:wp="http://schemas.openxmlformats.org/drawingml/2006/wordprocessingDrawing" distT="0" distB="0" distL="0" distR="0">
             <wp:extent cx="5760720" cy="3840480"/>
             <wp:effectExtent l="0" t="0" r="0" b="0"/>
-            <wp:docPr id="5" name="D4 道歉"/>
+            <wp:docPr id="5" name="V4-D4"/>
             <wp:cNvGraphicFramePr>
               <a:graphicFrameLocks xmlns:a="http://schemas.openxmlformats.org/drawingml/2006/main" noChangeAspect="1"/>
             </wp:cNvGraphicFramePr>
@@ -4539,7 +4539,7 @@
               <a:graphicData uri="http://schemas.openxmlformats.org/drawingml/2006/picture">
                 <pic:pic xmlns:pic="http://schemas.openxmlformats.org/drawingml/2006/picture">
                   <pic:nvPicPr>
-                    <pic:cNvPr id="0" name="D4-apology-stream.jpg"/>
+                    <pic:cNvPr id="0" name="V4-D4.jpg"/>
                     <pic:cNvPicPr/>
                   </pic:nvPicPr>
                   <pic:blipFill>
@@ -4576,7 +4576,7 @@
           <w:szCs w:val="21"/>
           <w:color w:val="1A1A1A"/>
         </w:rPr>
-        <w:t xml:space="preserve">图 D4  道歉直播：舆论句 + 双条反噬 + 残字消音体</w:t>
+        <w:t xml:space="preserve">图 D4  L4_S02：CHAR_apology_bow + CREEP_3 + cracked/shatter FX</w:t>
       </w:r>
     </w:p>
     <w:p>
@@ -4755,7 +4755,7 @@
           <w:szCs w:val="21"/>
           <w:color w:val="1A1A1A"/>
         </w:rPr>
-        <w:t xml:space="preserve">最后一句仍只给 3—4 个 zone。黑条落点直接映射结局 flag（例如：留下共生 / 逼她说完 / 吞掉「我」导致空白）。2—3 个结局足够，禁止二十结局收集癖。</w:t>
+        <w:t xml:space="preserve">最后一句仍只给 3—4 个 zone。黑条落点直接映射结局 flag（例如：留下共生 / 逼她说完 / 吞掉「我」导致空白）。当前机器层有 4 个结局 ID（A/B/C/C’），禁止二十结局收集癖。</w:t>
       </w:r>
     </w:p>
     <w:p>
@@ -5135,7 +5135,7 @@
           <wp:inline xmlns:wp="http://schemas.openxmlformats.org/drawingml/2006/wordprocessingDrawing" distT="0" distB="0" distL="0" distR="0">
             <wp:extent cx="5760720" cy="3840480"/>
             <wp:effectExtent l="0" t="0" r="0" b="0"/>
-            <wp:docPr id="6" name="D5 终局"/>
+            <wp:docPr id="6" name="V4-D5"/>
             <wp:cNvGraphicFramePr>
               <a:graphicFrameLocks xmlns:a="http://schemas.openxmlformats.org/drawingml/2006/main" noChangeAspect="1"/>
             </wp:cNvGraphicFramePr>
@@ -5143,7 +5143,7 @@
               <a:graphicData uri="http://schemas.openxmlformats.org/drawingml/2006/picture">
                 <pic:pic xmlns:pic="http://schemas.openxmlformats.org/drawingml/2006/picture">
                   <pic:nvPicPr>
-                    <pic:cNvPr id="0" name="D5-finale-room.jpg"/>
+                    <pic:cNvPr id="0" name="V4-D5.jpg"/>
                     <pic:cNvPicPr/>
                   </pic:nvPicPr>
                   <pic:blipFill>
@@ -5180,7 +5180,7 @@
           <w:szCs w:val="21"/>
           <w:color w:val="1A1A1A"/>
         </w:rPr>
-        <w:t xml:space="preserve">图 D5  终局：终句黑条即选择 + Stage3 重叠</w:t>
+        <w:t xml:space="preserve">图 D5  L5_S03：CHAR_final_speaking + ENDING_echo_overlap</w:t>
       </w:r>
     </w:p>
     <w:p>
@@ -5735,7 +5735,7 @@
           <wp:inline xmlns:wp="http://schemas.openxmlformats.org/drawingml/2006/wordprocessingDrawing" distT="0" distB="0" distL="0" distR="0">
             <wp:extent cx="5760720" cy="3840480"/>
             <wp:effectExtent l="0" t="0" r="0" b="0"/>
-            <wp:docPr id="7" name="D6 三阶段"/>
+            <wp:docPr id="7" name="V4-D6"/>
             <wp:cNvGraphicFramePr>
               <a:graphicFrameLocks xmlns:a="http://schemas.openxmlformats.org/drawingml/2006/main" noChangeAspect="1"/>
             </wp:cNvGraphicFramePr>
@@ -5743,7 +5743,7 @@
               <a:graphicData uri="http://schemas.openxmlformats.org/drawingml/2006/picture">
                 <pic:pic xmlns:pic="http://schemas.openxmlformats.org/drawingml/2006/picture">
                   <pic:nvPicPr>
-                    <pic:cNvPr id="0" name="D6-creature-stages.jpg"/>
+                    <pic:cNvPr id="0" name="V4-D6.jpg"/>
                     <pic:cNvPicPr/>
                   </pic:nvPicPr>
                   <pic:blipFill>
@@ -5780,7 +5780,7 @@
           <w:szCs w:val="21"/>
           <w:color w:val="1A1A1A"/>
         </w:rPr>
-        <w:t xml:space="preserve">图 D6  消音体 Stage1→2→3（黑条+残字，非鬼脸）</w:t>
+        <w:t xml:space="preserve">图 D6  V4 stage contract：CREEP_1 → CREEP_2 → CREEP_3</w:t>
       </w:r>
     </w:p>
     <w:p>
@@ -6377,7 +6377,7 @@
           <w:rFonts w:ascii="Calibri" w:hAnsi="Calibri" w:eastAsia="Microsoft YaHei"/>
           <w:sz w:val="21"/>
         </w:rPr>
-        <w:t>• 要做：约 20—30 分钟；五关；约 25 句可处理台词；2—3 结局；消音体 3 阶段</w:t>
+        <w:t xml:space="preserve">• 要做：约 30—36 分钟；开场 + 五关；35 句可处理台词；4 个机器结局 ID；消音体 3 阶段</w:t>
       </w:r>
     </w:p>
     <w:p>
@@ -6407,7 +6407,7 @@
           <w:szCs w:val="21"/>
           <w:color w:val="1A1A1A"/>
         </w:rPr>
-        <w:t xml:space="preserve">原图 PNG：storyboard/demo-effects/frames/D0–D6*.png</w:t>
+        <w:t xml:space="preserve">原图/场景母版：art/bg/ 与 storyboard/v4-prop-lock/</w:t>
       </w:r>
     </w:p>
     <w:p>
@@ -6421,7 +6421,7 @@
           <w:szCs w:val="21"/>
           <w:color w:val="1A1A1A"/>
         </w:rPr>
-        <w:t xml:space="preserve">提示词：storyboard/demo-effects/prompts/（中文）</w:t>
+        <w:t xml:space="preserve">V4 资产提示词：art/v4/playable/prompts/（edit 端点 + identity lock）</w:t>
       </w:r>
     </w:p>
     <w:p>
@@ -6435,7 +6435,7 @@
           <w:szCs w:val="21"/>
           <w:color w:val="1A1A1A"/>
         </w:rPr>
-        <w:t xml:space="preserve">生成脚本：storyboard/demo-effects/gen_demo.sh</w:t>
+        <w:t xml:space="preserve">V4 资产生成/校验：art/v4/playable/generate.sh · validate.py</w:t>
       </w:r>
     </w:p>
     <w:p>
@@ -6449,7 +6449,7 @@
           <w:szCs w:val="21"/>
           <w:color w:val="1A1A1A"/>
         </w:rPr>
-        <w:t xml:space="preserve">完整策划：请替我沉默-游戏策划案.docx · schedule.md · selling-points.md · art-style.md</w:t>
+        <w:t xml:space="preserve">完整台本：台本.md · script/chapters.json；策划/规范：schedule.md · selling-points.md · art-style.md；资产：art/v4/playable/README.md</w:t>
       </w:r>
     </w:p>
     <w:sectPr>

</xml_diff>